<commit_message>
manual invoice rentaland product changes
</commit_message>
<xml_diff>
--- a/invoice/revoinvoiceproduct.docx
+++ b/invoice/revoinvoiceproduct.docx
@@ -2732,7 +2732,10 @@
         <w:spacing w:after="0"/>
         <w:ind/>
         <w:jc w:val="center"/>
-        <w:rPr/>
+        <w:rPr>
+          <w:b/>
+          <w:bCs/>
+        </w:rPr>
       </w:pPr>
       <w:r>
         <w:rPr>
@@ -2744,10 +2747,17 @@
       <w:r>
         <w:rPr>
           <w:rFonts w:ascii="Calibri" w:hAnsi="Calibri" w:eastAsia="Calibri" w:cs="Calibri"/>
+          <w:b/>
+          <w:bCs/>
         </w:rPr>
         <w:t xml:space="preserve">Sub Total:{#invoicedata}{subtotal}{/}</w:t>
       </w:r>
-      <w:r/>
+      <w:r>
+        <w:rPr>
+          <w:b/>
+          <w:bCs/>
+        </w:rPr>
+      </w:r>
     </w:p>
     <w:p>
       <w:pPr>
@@ -2755,17 +2765,24 @@
         <w:spacing w:after="0"/>
         <w:ind/>
         <w:jc w:val="center"/>
-        <w:rPr/>
+        <w:rPr>
+          <w:b/>
+          <w:bCs/>
+        </w:rPr>
       </w:pPr>
       <w:r>
         <w:rPr>
           <w:rFonts w:ascii="Calibri" w:hAnsi="Calibri" w:eastAsia="Calibri" w:cs="Calibri"/>
+          <w:b/>
+          <w:bCs/>
         </w:rPr>
         <w:tab/>
       </w:r>
       <w:r>
         <w:rPr>
           <w:rFonts w:ascii="Calibri" w:hAnsi="Calibri" w:eastAsia="Calibri" w:cs="Calibri"/>
+          <w:b/>
+          <w:bCs/>
           <w:lang w:val="en-GB"/>
         </w:rPr>
         <w:t xml:space="preserve">                                                                                                                  </w:t>
@@ -2773,10 +2790,17 @@
       <w:r>
         <w:rPr>
           <w:rFonts w:ascii="Calibri" w:hAnsi="Calibri" w:eastAsia="Calibri" w:cs="Calibri"/>
+          <w:b/>
+          <w:bCs/>
         </w:rPr>
         <w:t xml:space="preserve">Tax:{#invoicedata}{taxamount}{/}</w:t>
       </w:r>
-      <w:r/>
+      <w:r>
+        <w:rPr>
+          <w:b/>
+          <w:bCs/>
+        </w:rPr>
+      </w:r>
     </w:p>
     <w:p>
       <w:pPr>
@@ -2795,29 +2819,52 @@
       <w:r>
         <w:rPr>
           <w:rFonts w:ascii="Calibri" w:hAnsi="Calibri" w:eastAsia="Calibri" w:cs="Calibri"/>
+          <w:b/>
+          <w:bCs/>
         </w:rPr>
         <w:tab/>
       </w:r>
       <w:r>
         <w:rPr>
           <w:rFonts w:ascii="Calibri" w:hAnsi="Calibri" w:eastAsia="Calibri" w:cs="Calibri"/>
+          <w:b/>
+          <w:bCs/>
           <w:lang w:val="en-GB"/>
         </w:rPr>
-        <w:t xml:space="preserve">                                                                                                         </w:t>
+        <w:t xml:space="preserve">                                                                             </w:t>
       </w:r>
       <w:r>
         <w:rPr>
           <w:rFonts w:ascii="Calibri" w:hAnsi="Calibri" w:eastAsia="Calibri" w:cs="Calibri"/>
+          <w:b/>
+          <w:bCs/>
         </w:rPr>
         <w:t xml:space="preserve">Total amount Paid:{#invoicedata}{total}</w:t>
       </w:r>
-      <w:r/>
       <w:r>
         <w:rPr>
           <w:rFonts w:ascii="Calibri" w:hAnsi="Calibri" w:eastAsia="Calibri" w:cs="Calibri"/>
+          <w:b/>
+          <w:bCs/>
           <w:lang w:val="en-GB"/>
         </w:rPr>
         <w:t xml:space="preserve"> </w:t>
+      </w:r>
+      <w:r>
+        <w:rPr>
+          <w:rFonts w:ascii="Calibri" w:hAnsi="Calibri" w:eastAsia="Calibri" w:cs="Calibri"/>
+          <w:b/>
+          <w:bCs/>
+        </w:rPr>
+        <w:t xml:space="preserve">{/}</w:t>
+      </w:r>
+      <w:r>
+        <w:rPr>
+          <w:rFonts w:ascii="Calibri" w:hAnsi="Calibri" w:eastAsia="Calibri" w:cs="Calibri"/>
+          <w:b/>
+          <w:bCs/>
+          <w:lang w:val="en-GB"/>
+        </w:rPr>
       </w:r>
       <w:r>
         <w:rPr>
@@ -2870,121 +2917,11 @@
       </w:pPr>
       <w:r>
         <w:rPr>
-          <w:rFonts w:ascii="Calibri" w:hAnsi="Calibri" w:eastAsia="Calibri" w:cs="Calibri"/>
-          <w:b/>
-          <w:bCs/>
-          <w:color w:val="000000" w:themeColor="text1"/>
-        </w:rPr>
-        <w:tab/>
-      </w:r>
-      <w:r>
-        <w:rPr>
-          <w:rFonts w:ascii="Calibri" w:hAnsi="Calibri" w:eastAsia="Calibri" w:cs="Calibri"/>
-          <w:b/>
-          <w:bCs/>
-          <w:color w:val="000000" w:themeColor="text1"/>
-        </w:rPr>
-        <w:tab/>
-      </w:r>
-      <w:r>
-        <w:rPr>
-          <w:rFonts w:ascii="Calibri" w:hAnsi="Calibri" w:eastAsia="Calibri" w:cs="Calibri"/>
-          <w:b/>
-          <w:bCs/>
-          <w:color w:val="000000" w:themeColor="text1"/>
-        </w:rPr>
-        <w:tab/>
-      </w:r>
-      <w:r>
-        <w:rPr>
-          <w:rFonts w:ascii="Calibri" w:hAnsi="Calibri" w:eastAsia="Calibri" w:cs="Calibri"/>
-          <w:b/>
-          <w:bCs/>
-          <w:color w:val="000000" w:themeColor="text1"/>
-        </w:rPr>
-        <w:tab/>
-      </w:r>
-      <w:r>
-        <w:rPr>
-          <w:rFonts w:ascii="Calibri" w:hAnsi="Calibri" w:eastAsia="Calibri" w:cs="Calibri"/>
-          <w:b/>
-          <w:bCs/>
-          <w:color w:val="000000" w:themeColor="text1"/>
-        </w:rPr>
-        <w:tab/>
-      </w:r>
-      <w:r>
-        <w:rPr>
-          <w:rFonts w:ascii="Calibri" w:hAnsi="Calibri" w:eastAsia="Calibri" w:cs="Calibri"/>
-          <w:b/>
-          <w:bCs/>
-          <w:color w:val="000000" w:themeColor="text1"/>
-        </w:rPr>
-        <w:tab/>
-      </w:r>
-      <w:r>
-        <w:rPr>
-          <w:rFonts w:ascii="Calibri" w:hAnsi="Calibri" w:eastAsia="Calibri" w:cs="Calibri"/>
-          <w:b/>
-          <w:bCs/>
-          <w:color w:val="000000" w:themeColor="text1"/>
-        </w:rPr>
-        <w:tab/>
-      </w:r>
-      <w:r>
-        <w:rPr>
-          <w:rFonts w:ascii="Calibri" w:hAnsi="Calibri" w:eastAsia="Calibri" w:cs="Calibri"/>
-          <w:b/>
-          <w:bCs/>
-          <w:color w:val="000000" w:themeColor="text1"/>
-        </w:rPr>
-        <w:tab/>
-      </w:r>
-      <w:r>
-        <w:rPr>
           <w:rFonts w:ascii="Calibri" w:hAnsi="Calibri" w:cs="Calibri"/>
           <w:b/>
           <w:color w:val="000000" w:themeColor="text1"/>
         </w:rPr>
       </w:r>
-    </w:p>
-    <w:p>
-      <w:pPr>
-        <w:pBdr/>
-        <w:spacing/>
-        <w:ind/>
-        <w:rPr>
-          <w:rFonts w:ascii="Calibri" w:hAnsi="Calibri" w:cs="Calibri"/>
-        </w:rPr>
-        <w:sectPr>
-          <w:footnotePr/>
-          <w:endnotePr/>
-          <w:type w:val="continuous"/>
-          <w:pgSz w:h="15840" w:orient="portrait" w:w="12240"/>
-          <w:pgMar w:top="432" w:right="432" w:bottom="432" w:left="432" w:header="709" w:footer="709" w:gutter="0"/>
-          <w:cols w:num="2" w:sep="0" w:space="709" w:equalWidth="1"/>
-        </w:sectPr>
-      </w:pPr>
-      <w:r>
-        <w:rPr>
-          <w:rFonts w:ascii="Calibri" w:hAnsi="Calibri" w:cs="Calibri"/>
-        </w:rPr>
-      </w:r>
-      <w:r>
-        <w:rPr>
-          <w:rFonts w:ascii="Calibri" w:hAnsi="Calibri" w:cs="Calibri"/>
-        </w:rPr>
-      </w:r>
-    </w:p>
-    <w:p>
-      <w:pPr>
-        <w:pBdr/>
-        <w:spacing/>
-        <w:ind/>
-        <w:rPr>
-          <w:rFonts w:ascii="Calibri" w:hAnsi="Calibri" w:cs="Calibri"/>
-        </w:rPr>
-      </w:pPr>
       <w:r>
         <w:rPr>
           <w:rFonts w:ascii="Calibri" w:hAnsi="Calibri" w:eastAsia="Calibri" w:cs="Calibri"/>
@@ -2994,6 +2931,13 @@
       <w:r>
         <w:rPr>
           <w:rFonts w:ascii="Calibri" w:hAnsi="Calibri" w:cs="Calibri"/>
+        </w:rPr>
+      </w:r>
+      <w:r>
+        <w:rPr>
+          <w:rFonts w:ascii="Calibri" w:hAnsi="Calibri" w:cs="Calibri"/>
+          <w:b/>
+          <w:color w:val="000000" w:themeColor="text1"/>
         </w:rPr>
       </w:r>
     </w:p>

</xml_diff>

<commit_message>
fileupload manual rental and non rental
</commit_message>
<xml_diff>
--- a/invoice/revoinvoiceproduct.docx
+++ b/invoice/revoinvoiceproduct.docx
@@ -2742,7 +2742,7 @@
           <w:rFonts w:ascii="Calibri" w:hAnsi="Calibri" w:eastAsia="Calibri" w:cs="Calibri"/>
           <w:lang w:val="en-GB"/>
         </w:rPr>
-        <w:t xml:space="preserve">                                                                                                                </w:t>
+        <w:t xml:space="preserve">                                                                                </w:t>
       </w:r>
       <w:r>
         <w:rPr>
@@ -2785,7 +2785,7 @@
           <w:bCs/>
           <w:lang w:val="en-GB"/>
         </w:rPr>
-        <w:t xml:space="preserve">                                                                                                                  </w:t>
+        <w:t xml:space="preserve">                                                                              </w:t>
       </w:r>
       <w:r>
         <w:rPr>

</xml_diff>